<commit_message>
feat: tích hợp phân tích độ nhạy COM6 (Phase 5) vào pipeline chính
</commit_message>
<xml_diff>
--- a/10_report/main/table_cmv.docx
+++ b/10_report/main/table_cmv.docx
@@ -262,7 +262,7 @@
                 <w:szCs w:val="20"/>
                 <w:color w:val="FF0000"/>
               </w:rPr>
-              <w:t xml:space="preserve">4.761</w:t>
+              <w:t xml:space="preserve">4.764</w:t>
             </w:r>
           </w:p>
         </w:tc>
@@ -376,7 +376,7 @@
                 <w:szCs w:val="20"/>
                 <w:color w:val="FF0000"/>
               </w:rPr>
-              <w:t xml:space="preserve">4.179</w:t>
+              <w:t xml:space="preserve">4.190</w:t>
             </w:r>
           </w:p>
         </w:tc>
@@ -604,7 +604,7 @@
                 <w:szCs w:val="20"/>
                 <w:color w:val="000000"/>
               </w:rPr>
-              <w:t xml:space="preserve">1.549</w:t>
+              <w:t xml:space="preserve">1.584</w:t>
             </w:r>
           </w:p>
         </w:tc>
@@ -1060,7 +1060,7 @@
                 <w:szCs w:val="20"/>
                 <w:color w:val="FF0000"/>
               </w:rPr>
-              <w:t xml:space="preserve">4.578</w:t>
+              <w:t xml:space="preserve">4.592</w:t>
             </w:r>
           </w:p>
         </w:tc>
@@ -1174,7 +1174,7 @@
                 <w:szCs w:val="20"/>
                 <w:color w:val="000000"/>
               </w:rPr>
-              <w:t xml:space="preserve">1.652</w:t>
+              <w:t xml:space="preserve">1.648</w:t>
             </w:r>
           </w:p>
         </w:tc>
@@ -1288,7 +1288,7 @@
                 <w:szCs w:val="20"/>
                 <w:color w:val="FF0000"/>
               </w:rPr>
-              <w:t xml:space="preserve">3.703</w:t>
+              <w:t xml:space="preserve">3.700</w:t>
             </w:r>
           </w:p>
         </w:tc>
@@ -1402,7 +1402,7 @@
                 <w:szCs w:val="20"/>
                 <w:color w:val="FF0000"/>
               </w:rPr>
-              <w:t xml:space="preserve">4.895</w:t>
+              <w:t xml:space="preserve">4.890</w:t>
             </w:r>
           </w:p>
         </w:tc>

</xml_diff>